<commit_message>
Configure pgpool2 and odoo18 load balancing
</commit_message>
<xml_diff>
--- a/replication db.docx
+++ b/replication db.docx
@@ -700,13 +700,8 @@
           </w:p>
           <w:p/>
           <w:p>
-            <w:proofErr w:type="gramStart"/>
-            <w:r>
-              <w:t>input :</w:t>
-            </w:r>
-            <w:proofErr w:type="gramEnd"/>
-            <w:r>
-              <w:t xml:space="preserve"> replica user password </w:t>
+            <w:r>
+              <w:t xml:space="preserve">input : replica user password </w:t>
             </w:r>
             <w:r>
               <w:rPr>
@@ -1041,19 +1036,11 @@
             </w:r>
             <w:proofErr w:type="spellStart"/>
             <w:r>
-              <w:t>pg_is_in_</w:t>
-            </w:r>
-            <w:proofErr w:type="gramStart"/>
-            <w:r>
-              <w:t>recovery</w:t>
-            </w:r>
-            <w:proofErr w:type="spellEnd"/>
-            <w:r>
-              <w:t>(</w:t>
-            </w:r>
-            <w:proofErr w:type="gramEnd"/>
-            <w:r>
-              <w:t>);"</w:t>
+              <w:t>pg_is_in_recovery</w:t>
+            </w:r>
+            <w:proofErr w:type="spellEnd"/>
+            <w:r>
+              <w:t>();"</w:t>
             </w:r>
           </w:p>
           <w:p/>
@@ -1063,19 +1050,11 @@
             </w:r>
             <w:proofErr w:type="spellStart"/>
             <w:r>
-              <w:t>pg_is_in_</w:t>
-            </w:r>
-            <w:proofErr w:type="gramStart"/>
-            <w:r>
-              <w:t>recovery</w:t>
-            </w:r>
-            <w:proofErr w:type="spellEnd"/>
-            <w:r>
-              <w:t>(</w:t>
-            </w:r>
-            <w:proofErr w:type="gramEnd"/>
-            <w:r>
-              <w:t>);</w:t>
+              <w:t>pg_is_in_recovery</w:t>
+            </w:r>
+            <w:proofErr w:type="spellEnd"/>
+            <w:r>
+              <w:t>();</w:t>
             </w:r>
           </w:p>
           <w:p/>
@@ -1257,6 +1236,98 @@
           <w:p/>
         </w:tc>
       </w:tr>
+      <w:tr>
+        <w:trPr>
+          <w:trHeight w:val="293"/>
+        </w:trPr>
+        <w:tc>
+          <w:tcPr>
+            <w:tcW w:w="0" w:type="auto"/>
+          </w:tcPr>
+          <w:p>
+            <w:r>
+              <w:t>Deamon reload</w:t>
+            </w:r>
+          </w:p>
+        </w:tc>
+        <w:tc>
+          <w:tcPr>
+            <w:tcW w:w="0" w:type="auto"/>
+          </w:tcPr>
+          <w:p>
+            <w:proofErr w:type="spellStart"/>
+            <w:r>
+              <w:t>sudo</w:t>
+            </w:r>
+            <w:proofErr w:type="spellEnd"/>
+            <w:r>
+              <w:t xml:space="preserve"> </w:t>
+            </w:r>
+            <w:proofErr w:type="spellStart"/>
+            <w:r>
+              <w:t>systemctl</w:t>
+            </w:r>
+            <w:proofErr w:type="spellEnd"/>
+            <w:r>
+              <w:t xml:space="preserve"> daemon-reload</w:t>
+            </w:r>
+          </w:p>
+          <w:p>
+            <w:proofErr w:type="spellStart"/>
+            <w:r>
+              <w:t>sudo</w:t>
+            </w:r>
+            <w:proofErr w:type="spellEnd"/>
+            <w:r>
+              <w:t xml:space="preserve"> </w:t>
+            </w:r>
+            <w:proofErr w:type="spellStart"/>
+            <w:r>
+              <w:t>systemctl</w:t>
+            </w:r>
+            <w:proofErr w:type="spellEnd"/>
+            <w:r>
+              <w:t xml:space="preserve"> restart odoo18.service</w:t>
+            </w:r>
+          </w:p>
+          <w:p>
+            <w:proofErr w:type="spellStart"/>
+            <w:r>
+              <w:t>sudo</w:t>
+            </w:r>
+            <w:proofErr w:type="spellEnd"/>
+            <w:r>
+              <w:t xml:space="preserve"> </w:t>
+            </w:r>
+            <w:proofErr w:type="spellStart"/>
+            <w:r>
+              <w:t>systemctl</w:t>
+            </w:r>
+            <w:proofErr w:type="spellEnd"/>
+            <w:r>
+              <w:t xml:space="preserve"> status odoo18.service</w:t>
+            </w:r>
+          </w:p>
+        </w:tc>
+        <w:tc>
+          <w:tcPr>
+            <w:tcW w:w="0" w:type="auto"/>
+          </w:tcPr>
+          <w:p/>
+        </w:tc>
+        <w:tc>
+          <w:tcPr>
+            <w:tcW w:w="0" w:type="auto"/>
+          </w:tcPr>
+          <w:p/>
+        </w:tc>
+        <w:tc>
+          <w:tcPr>
+            <w:tcW w:w="0" w:type="auto"/>
+          </w:tcPr>
+          <w:p/>
+        </w:tc>
+      </w:tr>
     </w:tbl>
     <w:p>
       <w:r>
@@ -1280,7 +1351,11 @@
       </w:r>
       <w:r>
         <w:noBreakHyphen/>
-        <w:t xml:space="preserve">balancing layer because Odoo itself doesn’t natively split read/write queries. The common approach is to use </w:t>
+        <w:t xml:space="preserve">balancing layer because Odoo itself doesn’t </w:t>
+      </w:r>
+      <w:r>
+        <w:lastRenderedPageBreak/>
+        <w:t xml:space="preserve">natively split read/write queries. The common approach is to use </w:t>
       </w:r>
       <w:proofErr w:type="spellStart"/>
       <w:r>
@@ -1349,7 +1424,6 @@
           <w:b/>
           <w:bCs/>
         </w:rPr>
-        <w:lastRenderedPageBreak/>
         <w:t>01</w:t>
       </w:r>
     </w:p>
@@ -1597,6 +1671,7 @@
     </w:p>
     <w:p>
       <w:r>
+        <w:lastRenderedPageBreak/>
         <w:t xml:space="preserve">In </w:t>
       </w:r>
       <w:proofErr w:type="spellStart"/>
@@ -1651,7 +1726,6 @@
         </w:numPr>
       </w:pPr>
       <w:r>
-        <w:lastRenderedPageBreak/>
         <w:t xml:space="preserve">Set </w:t>
       </w:r>
       <w:proofErr w:type="spellStart"/>
@@ -1933,6 +2007,7 @@
           <w:b/>
           <w:bCs/>
         </w:rPr>
+        <w:lastRenderedPageBreak/>
         <w:t>06</w:t>
       </w:r>
     </w:p>
@@ -1958,7 +2033,6 @@
     </w:p>
     <w:p>
       <w:r>
-        <w:lastRenderedPageBreak/>
         <w:t>Run SQL monitoring queries</w:t>
       </w:r>
     </w:p>
@@ -2135,6 +2209,1247 @@
         <w:t>-II</w:t>
       </w:r>
     </w:p>
+    <w:p/>
+    <w:p/>
+    <w:p/>
+    <w:p/>
+    <w:p>
+      <w:pPr>
+        <w:spacing w:before="100" w:beforeAutospacing="1" w:after="100" w:afterAutospacing="1" w:line="240" w:lineRule="auto"/>
+        <w:outlineLvl w:val="2"/>
+        <w:rPr>
+          <w:rFonts w:ascii="Times New Roman" w:eastAsia="Times New Roman" w:hAnsi="Times New Roman" w:cs="Times New Roman"/>
+          <w:b/>
+          <w:bCs/>
+          <w:kern w:val="0"/>
+          <w:sz w:val="27"/>
+          <w:szCs w:val="27"/>
+          <w14:ligatures w14:val="none"/>
+        </w:rPr>
+      </w:pPr>
+      <w:r>
+        <w:rPr>
+          <w:rFonts w:ascii="Times New Roman" w:eastAsia="Times New Roman" w:hAnsi="Times New Roman" w:cs="Times New Roman"/>
+          <w:b/>
+          <w:bCs/>
+          <w:kern w:val="0"/>
+          <w:sz w:val="27"/>
+          <w:szCs w:val="27"/>
+          <w14:ligatures w14:val="none"/>
+        </w:rPr>
+        <w:lastRenderedPageBreak/>
+        <w:t xml:space="preserve">How to check </w:t>
+      </w:r>
+      <w:proofErr w:type="spellStart"/>
+      <w:r>
+        <w:rPr>
+          <w:rFonts w:ascii="Times New Roman" w:eastAsia="Times New Roman" w:hAnsi="Times New Roman" w:cs="Times New Roman"/>
+          <w:b/>
+          <w:bCs/>
+          <w:kern w:val="0"/>
+          <w:sz w:val="27"/>
+          <w:szCs w:val="27"/>
+          <w14:ligatures w14:val="none"/>
+        </w:rPr>
+        <w:t>Pgpool</w:t>
+      </w:r>
+      <w:proofErr w:type="spellEnd"/>
+      <w:r>
+        <w:rPr>
+          <w:rFonts w:ascii="Times New Roman" w:eastAsia="Times New Roman" w:hAnsi="Times New Roman" w:cs="Times New Roman"/>
+          <w:b/>
+          <w:bCs/>
+          <w:kern w:val="0"/>
+          <w:sz w:val="27"/>
+          <w:szCs w:val="27"/>
+          <w14:ligatures w14:val="none"/>
+        </w:rPr>
+        <w:t xml:space="preserve"> load balancing</w:t>
+      </w:r>
+    </w:p>
+    <w:p>
+      <w:pPr>
+        <w:numPr>
+          <w:ilvl w:val="0"/>
+          <w:numId w:val="8"/>
+        </w:numPr>
+        <w:spacing w:before="100" w:beforeAutospacing="1" w:after="100" w:afterAutospacing="1" w:line="240" w:lineRule="auto"/>
+        <w:rPr>
+          <w:rFonts w:ascii="Times New Roman" w:eastAsia="Times New Roman" w:hAnsi="Times New Roman" w:cs="Times New Roman"/>
+          <w:kern w:val="0"/>
+          <w:szCs w:val="24"/>
+          <w14:ligatures w14:val="none"/>
+        </w:rPr>
+      </w:pPr>
+      <w:r>
+        <w:rPr>
+          <w:rFonts w:ascii="Times New Roman" w:eastAsia="Times New Roman" w:hAnsi="Times New Roman" w:cs="Times New Roman"/>
+          <w:b/>
+          <w:bCs/>
+          <w:kern w:val="0"/>
+          <w:szCs w:val="24"/>
+          <w14:ligatures w14:val="none"/>
+        </w:rPr>
+        <w:t xml:space="preserve">Connect to </w:t>
+      </w:r>
+      <w:proofErr w:type="spellStart"/>
+      <w:r>
+        <w:rPr>
+          <w:rFonts w:ascii="Times New Roman" w:eastAsia="Times New Roman" w:hAnsi="Times New Roman" w:cs="Times New Roman"/>
+          <w:b/>
+          <w:bCs/>
+          <w:kern w:val="0"/>
+          <w:szCs w:val="24"/>
+          <w14:ligatures w14:val="none"/>
+        </w:rPr>
+        <w:t>Pgpool</w:t>
+      </w:r>
+      <w:proofErr w:type="spellEnd"/>
+      <w:r>
+        <w:rPr>
+          <w:rFonts w:ascii="Times New Roman" w:eastAsia="Times New Roman" w:hAnsi="Times New Roman" w:cs="Times New Roman"/>
+          <w:b/>
+          <w:bCs/>
+          <w:kern w:val="0"/>
+          <w:szCs w:val="24"/>
+          <w14:ligatures w14:val="none"/>
+        </w:rPr>
+        <w:t xml:space="preserve"> and run:</w:t>
+      </w:r>
+    </w:p>
+    <w:p>
+      <w:pPr>
+        <w:spacing w:beforeAutospacing="1" w:after="0" w:afterAutospacing="1" w:line="240" w:lineRule="auto"/>
+        <w:ind w:left="720"/>
+        <w:rPr>
+          <w:rFonts w:ascii="Times New Roman" w:eastAsia="Times New Roman" w:hAnsi="Times New Roman" w:cs="Times New Roman"/>
+          <w:kern w:val="0"/>
+          <w:szCs w:val="24"/>
+          <w14:ligatures w14:val="none"/>
+        </w:rPr>
+      </w:pPr>
+      <w:r>
+        <w:rPr>
+          <w:rFonts w:ascii="Times New Roman" w:eastAsia="Times New Roman" w:hAnsi="Times New Roman" w:cs="Times New Roman"/>
+          <w:kern w:val="0"/>
+          <w:szCs w:val="24"/>
+          <w14:ligatures w14:val="none"/>
+        </w:rPr>
+        <w:t>bash</w:t>
+      </w:r>
+    </w:p>
+    <w:p>
+      <w:pPr>
+        <w:tabs>
+          <w:tab w:val="left" w:pos="916"/>
+          <w:tab w:val="left" w:pos="1832"/>
+          <w:tab w:val="left" w:pos="2748"/>
+          <w:tab w:val="left" w:pos="3664"/>
+          <w:tab w:val="left" w:pos="4580"/>
+          <w:tab w:val="left" w:pos="5496"/>
+          <w:tab w:val="left" w:pos="6412"/>
+          <w:tab w:val="left" w:pos="7328"/>
+          <w:tab w:val="left" w:pos="8244"/>
+          <w:tab w:val="left" w:pos="9160"/>
+          <w:tab w:val="left" w:pos="10076"/>
+          <w:tab w:val="left" w:pos="10992"/>
+          <w:tab w:val="left" w:pos="11908"/>
+          <w:tab w:val="left" w:pos="12824"/>
+          <w:tab w:val="left" w:pos="13740"/>
+          <w:tab w:val="left" w:pos="14656"/>
+        </w:tabs>
+        <w:spacing w:after="0" w:line="240" w:lineRule="auto"/>
+        <w:ind w:left="720"/>
+        <w:rPr>
+          <w:rFonts w:ascii="Courier New" w:eastAsia="Times New Roman" w:hAnsi="Courier New" w:cs="Courier New"/>
+          <w:kern w:val="0"/>
+          <w:sz w:val="20"/>
+          <w:szCs w:val="20"/>
+          <w14:ligatures w14:val="none"/>
+        </w:rPr>
+      </w:pPr>
+      <w:proofErr w:type="spellStart"/>
+      <w:r>
+        <w:rPr>
+          <w:rFonts w:ascii="Courier New" w:eastAsia="Times New Roman" w:hAnsi="Courier New" w:cs="Courier New"/>
+          <w:kern w:val="0"/>
+          <w:sz w:val="20"/>
+          <w:szCs w:val="20"/>
+          <w14:ligatures w14:val="none"/>
+        </w:rPr>
+        <w:t>psql</w:t>
+      </w:r>
+      <w:proofErr w:type="spellEnd"/>
+      <w:r>
+        <w:rPr>
+          <w:rFonts w:ascii="Courier New" w:eastAsia="Times New Roman" w:hAnsi="Courier New" w:cs="Courier New"/>
+          <w:kern w:val="0"/>
+          <w:sz w:val="20"/>
+          <w:szCs w:val="20"/>
+          <w14:ligatures w14:val="none"/>
+        </w:rPr>
+        <w:t xml:space="preserve"> -h 156.67.220.92 -p 9999 -U </w:t>
+      </w:r>
+      <w:proofErr w:type="spellStart"/>
+      <w:r>
+        <w:rPr>
+          <w:rFonts w:ascii="Courier New" w:eastAsia="Times New Roman" w:hAnsi="Courier New" w:cs="Courier New"/>
+          <w:kern w:val="0"/>
+          <w:sz w:val="20"/>
+          <w:szCs w:val="20"/>
+          <w14:ligatures w14:val="none"/>
+        </w:rPr>
+        <w:t>odoo</w:t>
+      </w:r>
+      <w:proofErr w:type="spellEnd"/>
+      <w:r>
+        <w:rPr>
+          <w:rFonts w:ascii="Courier New" w:eastAsia="Times New Roman" w:hAnsi="Courier New" w:cs="Courier New"/>
+          <w:kern w:val="0"/>
+          <w:sz w:val="20"/>
+          <w:szCs w:val="20"/>
+          <w14:ligatures w14:val="none"/>
+        </w:rPr>
+        <w:t xml:space="preserve"> -d </w:t>
+      </w:r>
+      <w:proofErr w:type="spellStart"/>
+      <w:r>
+        <w:rPr>
+          <w:rFonts w:ascii="Courier New" w:eastAsia="Times New Roman" w:hAnsi="Courier New" w:cs="Courier New"/>
+          <w:kern w:val="0"/>
+          <w:sz w:val="20"/>
+          <w:szCs w:val="20"/>
+          <w14:ligatures w14:val="none"/>
+        </w:rPr>
+        <w:t>postgres</w:t>
+      </w:r>
+      <w:proofErr w:type="spellEnd"/>
+    </w:p>
+    <w:p>
+      <w:pPr>
+        <w:spacing w:before="100" w:beforeAutospacing="1" w:after="100" w:afterAutospacing="1" w:line="240" w:lineRule="auto"/>
+        <w:ind w:left="720"/>
+        <w:rPr>
+          <w:rFonts w:ascii="Times New Roman" w:eastAsia="Times New Roman" w:hAnsi="Times New Roman" w:cs="Times New Roman"/>
+          <w:kern w:val="0"/>
+          <w:szCs w:val="24"/>
+          <w14:ligatures w14:val="none"/>
+        </w:rPr>
+      </w:pPr>
+      <w:r>
+        <w:rPr>
+          <w:rFonts w:ascii="Times New Roman" w:eastAsia="Times New Roman" w:hAnsi="Times New Roman" w:cs="Times New Roman"/>
+          <w:kern w:val="0"/>
+          <w:szCs w:val="24"/>
+          <w14:ligatures w14:val="none"/>
+        </w:rPr>
+        <w:t xml:space="preserve">Then inside </w:t>
+      </w:r>
+      <w:proofErr w:type="spellStart"/>
+      <w:r>
+        <w:rPr>
+          <w:rFonts w:ascii="Times New Roman" w:eastAsia="Times New Roman" w:hAnsi="Times New Roman" w:cs="Times New Roman"/>
+          <w:kern w:val="0"/>
+          <w:szCs w:val="24"/>
+          <w14:ligatures w14:val="none"/>
+        </w:rPr>
+        <w:t>psql</w:t>
+      </w:r>
+      <w:proofErr w:type="spellEnd"/>
+      <w:r>
+        <w:rPr>
+          <w:rFonts w:ascii="Times New Roman" w:eastAsia="Times New Roman" w:hAnsi="Times New Roman" w:cs="Times New Roman"/>
+          <w:kern w:val="0"/>
+          <w:szCs w:val="24"/>
+          <w14:ligatures w14:val="none"/>
+        </w:rPr>
+        <w:t>:</w:t>
+      </w:r>
+    </w:p>
+    <w:p>
+      <w:pPr>
+        <w:spacing w:beforeAutospacing="1" w:after="0" w:afterAutospacing="1" w:line="240" w:lineRule="auto"/>
+        <w:ind w:left="720"/>
+        <w:rPr>
+          <w:rFonts w:ascii="Times New Roman" w:eastAsia="Times New Roman" w:hAnsi="Times New Roman" w:cs="Times New Roman"/>
+          <w:kern w:val="0"/>
+          <w:szCs w:val="24"/>
+          <w14:ligatures w14:val="none"/>
+        </w:rPr>
+      </w:pPr>
+      <w:proofErr w:type="spellStart"/>
+      <w:r>
+        <w:rPr>
+          <w:rFonts w:ascii="Times New Roman" w:eastAsia="Times New Roman" w:hAnsi="Times New Roman" w:cs="Times New Roman"/>
+          <w:kern w:val="0"/>
+          <w:szCs w:val="24"/>
+          <w14:ligatures w14:val="none"/>
+        </w:rPr>
+        <w:t>sql</w:t>
+      </w:r>
+      <w:proofErr w:type="spellEnd"/>
+    </w:p>
+    <w:p>
+      <w:pPr>
+        <w:tabs>
+          <w:tab w:val="left" w:pos="916"/>
+          <w:tab w:val="left" w:pos="1832"/>
+          <w:tab w:val="left" w:pos="2748"/>
+          <w:tab w:val="left" w:pos="3664"/>
+          <w:tab w:val="left" w:pos="4580"/>
+          <w:tab w:val="left" w:pos="5496"/>
+          <w:tab w:val="left" w:pos="6412"/>
+          <w:tab w:val="left" w:pos="7328"/>
+          <w:tab w:val="left" w:pos="8244"/>
+          <w:tab w:val="left" w:pos="9160"/>
+          <w:tab w:val="left" w:pos="10076"/>
+          <w:tab w:val="left" w:pos="10992"/>
+          <w:tab w:val="left" w:pos="11908"/>
+          <w:tab w:val="left" w:pos="12824"/>
+          <w:tab w:val="left" w:pos="13740"/>
+          <w:tab w:val="left" w:pos="14656"/>
+        </w:tabs>
+        <w:spacing w:after="0" w:line="240" w:lineRule="auto"/>
+        <w:ind w:left="720"/>
+        <w:rPr>
+          <w:rFonts w:ascii="Courier New" w:eastAsia="Times New Roman" w:hAnsi="Courier New" w:cs="Courier New"/>
+          <w:kern w:val="0"/>
+          <w:sz w:val="20"/>
+          <w:szCs w:val="20"/>
+          <w14:ligatures w14:val="none"/>
+        </w:rPr>
+      </w:pPr>
+      <w:r>
+        <w:rPr>
+          <w:rFonts w:ascii="Courier New" w:eastAsia="Times New Roman" w:hAnsi="Courier New" w:cs="Courier New"/>
+          <w:kern w:val="0"/>
+          <w:sz w:val="20"/>
+          <w:szCs w:val="20"/>
+          <w14:ligatures w14:val="none"/>
+        </w:rPr>
+        <w:t xml:space="preserve">SHOW </w:t>
+      </w:r>
+      <w:proofErr w:type="spellStart"/>
+      <w:r>
+        <w:rPr>
+          <w:rFonts w:ascii="Courier New" w:eastAsia="Times New Roman" w:hAnsi="Courier New" w:cs="Courier New"/>
+          <w:kern w:val="0"/>
+          <w:sz w:val="20"/>
+          <w:szCs w:val="20"/>
+          <w14:ligatures w14:val="none"/>
+        </w:rPr>
+        <w:t>pool_nodes</w:t>
+      </w:r>
+      <w:proofErr w:type="spellEnd"/>
+      <w:r>
+        <w:rPr>
+          <w:rFonts w:ascii="Courier New" w:eastAsia="Times New Roman" w:hAnsi="Courier New" w:cs="Courier New"/>
+          <w:kern w:val="0"/>
+          <w:sz w:val="20"/>
+          <w:szCs w:val="20"/>
+          <w14:ligatures w14:val="none"/>
+        </w:rPr>
+        <w:t>;</w:t>
+      </w:r>
+    </w:p>
+    <w:p>
+      <w:pPr>
+        <w:spacing w:before="100" w:beforeAutospacing="1" w:after="100" w:afterAutospacing="1" w:line="240" w:lineRule="auto"/>
+        <w:ind w:left="720"/>
+        <w:rPr>
+          <w:rFonts w:ascii="Times New Roman" w:eastAsia="Times New Roman" w:hAnsi="Times New Roman" w:cs="Times New Roman"/>
+          <w:kern w:val="0"/>
+          <w:szCs w:val="24"/>
+          <w14:ligatures w14:val="none"/>
+        </w:rPr>
+      </w:pPr>
+      <w:r>
+        <w:rPr>
+          <w:rFonts w:ascii="Times New Roman" w:eastAsia="Times New Roman" w:hAnsi="Times New Roman" w:cs="Times New Roman"/>
+          <w:kern w:val="0"/>
+          <w:szCs w:val="24"/>
+          <w14:ligatures w14:val="none"/>
+        </w:rPr>
+        <w:t xml:space="preserve">You should see both the </w:t>
+      </w:r>
+      <w:r>
+        <w:rPr>
+          <w:rFonts w:ascii="Times New Roman" w:eastAsia="Times New Roman" w:hAnsi="Times New Roman" w:cs="Times New Roman"/>
+          <w:b/>
+          <w:bCs/>
+          <w:kern w:val="0"/>
+          <w:szCs w:val="24"/>
+          <w14:ligatures w14:val="none"/>
+        </w:rPr>
+        <w:t>primary</w:t>
+      </w:r>
+      <w:r>
+        <w:rPr>
+          <w:rFonts w:ascii="Times New Roman" w:eastAsia="Times New Roman" w:hAnsi="Times New Roman" w:cs="Times New Roman"/>
+          <w:kern w:val="0"/>
+          <w:szCs w:val="24"/>
+          <w14:ligatures w14:val="none"/>
+        </w:rPr>
+        <w:t xml:space="preserve"> and </w:t>
+      </w:r>
+      <w:r>
+        <w:rPr>
+          <w:rFonts w:ascii="Times New Roman" w:eastAsia="Times New Roman" w:hAnsi="Times New Roman" w:cs="Times New Roman"/>
+          <w:b/>
+          <w:bCs/>
+          <w:kern w:val="0"/>
+          <w:szCs w:val="24"/>
+          <w14:ligatures w14:val="none"/>
+        </w:rPr>
+        <w:t>replica</w:t>
+      </w:r>
+      <w:r>
+        <w:rPr>
+          <w:rFonts w:ascii="Times New Roman" w:eastAsia="Times New Roman" w:hAnsi="Times New Roman" w:cs="Times New Roman"/>
+          <w:kern w:val="0"/>
+          <w:szCs w:val="24"/>
+          <w14:ligatures w14:val="none"/>
+        </w:rPr>
+        <w:t xml:space="preserve"> listed, with their status (</w:t>
+      </w:r>
+      <w:r>
+        <w:rPr>
+          <w:rFonts w:ascii="Courier New" w:eastAsia="Times New Roman" w:hAnsi="Courier New" w:cs="Courier New"/>
+          <w:kern w:val="0"/>
+          <w:sz w:val="20"/>
+          <w:szCs w:val="20"/>
+          <w14:ligatures w14:val="none"/>
+        </w:rPr>
+        <w:t>up</w:t>
+      </w:r>
+      <w:r>
+        <w:rPr>
+          <w:rFonts w:ascii="Times New Roman" w:eastAsia="Times New Roman" w:hAnsi="Times New Roman" w:cs="Times New Roman"/>
+          <w:kern w:val="0"/>
+          <w:szCs w:val="24"/>
+          <w14:ligatures w14:val="none"/>
+        </w:rPr>
+        <w:t>).</w:t>
+      </w:r>
+    </w:p>
+    <w:p>
+      <w:pPr>
+        <w:numPr>
+          <w:ilvl w:val="0"/>
+          <w:numId w:val="8"/>
+        </w:numPr>
+        <w:spacing w:before="100" w:beforeAutospacing="1" w:after="100" w:afterAutospacing="1" w:line="240" w:lineRule="auto"/>
+        <w:rPr>
+          <w:rFonts w:ascii="Times New Roman" w:eastAsia="Times New Roman" w:hAnsi="Times New Roman" w:cs="Times New Roman"/>
+          <w:kern w:val="0"/>
+          <w:szCs w:val="24"/>
+          <w14:ligatures w14:val="none"/>
+        </w:rPr>
+      </w:pPr>
+      <w:r>
+        <w:rPr>
+          <w:rFonts w:ascii="Times New Roman" w:eastAsia="Times New Roman" w:hAnsi="Times New Roman" w:cs="Times New Roman"/>
+          <w:b/>
+          <w:bCs/>
+          <w:kern w:val="0"/>
+          <w:szCs w:val="24"/>
+          <w14:ligatures w14:val="none"/>
+        </w:rPr>
+        <w:t xml:space="preserve">Enable query logging in </w:t>
+      </w:r>
+      <w:proofErr w:type="spellStart"/>
+      <w:r>
+        <w:rPr>
+          <w:rFonts w:ascii="Times New Roman" w:eastAsia="Times New Roman" w:hAnsi="Times New Roman" w:cs="Times New Roman"/>
+          <w:b/>
+          <w:bCs/>
+          <w:kern w:val="0"/>
+          <w:szCs w:val="24"/>
+          <w14:ligatures w14:val="none"/>
+        </w:rPr>
+        <w:t>Pgpool</w:t>
+      </w:r>
+      <w:proofErr w:type="spellEnd"/>
+      <w:r>
+        <w:rPr>
+          <w:rFonts w:ascii="Times New Roman" w:eastAsia="Times New Roman" w:hAnsi="Times New Roman" w:cs="Times New Roman"/>
+          <w:kern w:val="0"/>
+          <w:szCs w:val="24"/>
+          <w14:ligatures w14:val="none"/>
+        </w:rPr>
+        <w:t xml:space="preserve"> In </w:t>
+      </w:r>
+      <w:proofErr w:type="spellStart"/>
+      <w:r>
+        <w:rPr>
+          <w:rFonts w:ascii="Courier New" w:eastAsia="Times New Roman" w:hAnsi="Courier New" w:cs="Courier New"/>
+          <w:kern w:val="0"/>
+          <w:sz w:val="20"/>
+          <w:szCs w:val="20"/>
+          <w14:ligatures w14:val="none"/>
+        </w:rPr>
+        <w:t>pgpool.conf</w:t>
+      </w:r>
+      <w:proofErr w:type="spellEnd"/>
+      <w:r>
+        <w:rPr>
+          <w:rFonts w:ascii="Times New Roman" w:eastAsia="Times New Roman" w:hAnsi="Times New Roman" w:cs="Times New Roman"/>
+          <w:kern w:val="0"/>
+          <w:szCs w:val="24"/>
+          <w14:ligatures w14:val="none"/>
+        </w:rPr>
+        <w:t>, set:</w:t>
+      </w:r>
+    </w:p>
+    <w:p>
+      <w:pPr>
+        <w:spacing w:beforeAutospacing="1" w:after="0" w:afterAutospacing="1" w:line="240" w:lineRule="auto"/>
+        <w:ind w:left="720"/>
+        <w:rPr>
+          <w:rFonts w:ascii="Times New Roman" w:eastAsia="Times New Roman" w:hAnsi="Times New Roman" w:cs="Times New Roman"/>
+          <w:kern w:val="0"/>
+          <w:szCs w:val="24"/>
+          <w14:ligatures w14:val="none"/>
+        </w:rPr>
+      </w:pPr>
+      <w:r>
+        <w:rPr>
+          <w:rFonts w:ascii="Times New Roman" w:eastAsia="Times New Roman" w:hAnsi="Times New Roman" w:cs="Times New Roman"/>
+          <w:kern w:val="0"/>
+          <w:szCs w:val="24"/>
+          <w14:ligatures w14:val="none"/>
+        </w:rPr>
+        <w:t>conf</w:t>
+      </w:r>
+    </w:p>
+    <w:p>
+      <w:pPr>
+        <w:tabs>
+          <w:tab w:val="left" w:pos="916"/>
+          <w:tab w:val="left" w:pos="1832"/>
+          <w:tab w:val="left" w:pos="2748"/>
+          <w:tab w:val="left" w:pos="3664"/>
+          <w:tab w:val="left" w:pos="4580"/>
+          <w:tab w:val="left" w:pos="5496"/>
+          <w:tab w:val="left" w:pos="6412"/>
+          <w:tab w:val="left" w:pos="7328"/>
+          <w:tab w:val="left" w:pos="8244"/>
+          <w:tab w:val="left" w:pos="9160"/>
+          <w:tab w:val="left" w:pos="10076"/>
+          <w:tab w:val="left" w:pos="10992"/>
+          <w:tab w:val="left" w:pos="11908"/>
+          <w:tab w:val="left" w:pos="12824"/>
+          <w:tab w:val="left" w:pos="13740"/>
+          <w:tab w:val="left" w:pos="14656"/>
+        </w:tabs>
+        <w:spacing w:after="0" w:line="240" w:lineRule="auto"/>
+        <w:ind w:left="720"/>
+        <w:rPr>
+          <w:rFonts w:ascii="Courier New" w:eastAsia="Times New Roman" w:hAnsi="Courier New" w:cs="Courier New"/>
+          <w:kern w:val="0"/>
+          <w:sz w:val="20"/>
+          <w:szCs w:val="20"/>
+          <w14:ligatures w14:val="none"/>
+        </w:rPr>
+      </w:pPr>
+      <w:proofErr w:type="spellStart"/>
+      <w:r>
+        <w:rPr>
+          <w:rFonts w:ascii="Courier New" w:eastAsia="Times New Roman" w:hAnsi="Courier New" w:cs="Courier New"/>
+          <w:kern w:val="0"/>
+          <w:sz w:val="20"/>
+          <w:szCs w:val="20"/>
+          <w14:ligatures w14:val="none"/>
+        </w:rPr>
+        <w:t>log_statement</w:t>
+      </w:r>
+      <w:proofErr w:type="spellEnd"/>
+      <w:r>
+        <w:rPr>
+          <w:rFonts w:ascii="Courier New" w:eastAsia="Times New Roman" w:hAnsi="Courier New" w:cs="Courier New"/>
+          <w:kern w:val="0"/>
+          <w:sz w:val="20"/>
+          <w:szCs w:val="20"/>
+          <w14:ligatures w14:val="none"/>
+        </w:rPr>
+        <w:t xml:space="preserve"> = on</w:t>
+      </w:r>
+    </w:p>
+    <w:p>
+      <w:pPr>
+        <w:spacing w:before="100" w:beforeAutospacing="1" w:after="100" w:afterAutospacing="1" w:line="240" w:lineRule="auto"/>
+        <w:ind w:left="720"/>
+        <w:rPr>
+          <w:rFonts w:ascii="Times New Roman" w:eastAsia="Times New Roman" w:hAnsi="Times New Roman" w:cs="Times New Roman"/>
+          <w:kern w:val="0"/>
+          <w:szCs w:val="24"/>
+          <w14:ligatures w14:val="none"/>
+        </w:rPr>
+      </w:pPr>
+      <w:r>
+        <w:rPr>
+          <w:rFonts w:ascii="Times New Roman" w:eastAsia="Times New Roman" w:hAnsi="Times New Roman" w:cs="Times New Roman"/>
+          <w:kern w:val="0"/>
+          <w:szCs w:val="24"/>
+          <w14:ligatures w14:val="none"/>
+        </w:rPr>
+        <w:t xml:space="preserve">Restart </w:t>
+      </w:r>
+      <w:proofErr w:type="spellStart"/>
+      <w:r>
+        <w:rPr>
+          <w:rFonts w:ascii="Times New Roman" w:eastAsia="Times New Roman" w:hAnsi="Times New Roman" w:cs="Times New Roman"/>
+          <w:kern w:val="0"/>
+          <w:szCs w:val="24"/>
+          <w14:ligatures w14:val="none"/>
+        </w:rPr>
+        <w:t>Pgpool</w:t>
+      </w:r>
+      <w:proofErr w:type="spellEnd"/>
+      <w:r>
+        <w:rPr>
+          <w:rFonts w:ascii="Times New Roman" w:eastAsia="Times New Roman" w:hAnsi="Times New Roman" w:cs="Times New Roman"/>
+          <w:kern w:val="0"/>
+          <w:szCs w:val="24"/>
+          <w14:ligatures w14:val="none"/>
+        </w:rPr>
+        <w:t>:</w:t>
+      </w:r>
+    </w:p>
+    <w:p>
+      <w:pPr>
+        <w:spacing w:beforeAutospacing="1" w:after="0" w:afterAutospacing="1" w:line="240" w:lineRule="auto"/>
+        <w:ind w:left="720"/>
+        <w:rPr>
+          <w:rFonts w:ascii="Times New Roman" w:eastAsia="Times New Roman" w:hAnsi="Times New Roman" w:cs="Times New Roman"/>
+          <w:kern w:val="0"/>
+          <w:szCs w:val="24"/>
+          <w14:ligatures w14:val="none"/>
+        </w:rPr>
+      </w:pPr>
+      <w:r>
+        <w:rPr>
+          <w:rFonts w:ascii="Times New Roman" w:eastAsia="Times New Roman" w:hAnsi="Times New Roman" w:cs="Times New Roman"/>
+          <w:kern w:val="0"/>
+          <w:szCs w:val="24"/>
+          <w14:ligatures w14:val="none"/>
+        </w:rPr>
+        <w:t>bash</w:t>
+      </w:r>
+    </w:p>
+    <w:p>
+      <w:pPr>
+        <w:tabs>
+          <w:tab w:val="left" w:pos="916"/>
+          <w:tab w:val="left" w:pos="1832"/>
+          <w:tab w:val="left" w:pos="2748"/>
+          <w:tab w:val="left" w:pos="3664"/>
+          <w:tab w:val="left" w:pos="4580"/>
+          <w:tab w:val="left" w:pos="5496"/>
+          <w:tab w:val="left" w:pos="6412"/>
+          <w:tab w:val="left" w:pos="7328"/>
+          <w:tab w:val="left" w:pos="8244"/>
+          <w:tab w:val="left" w:pos="9160"/>
+          <w:tab w:val="left" w:pos="10076"/>
+          <w:tab w:val="left" w:pos="10992"/>
+          <w:tab w:val="left" w:pos="11908"/>
+          <w:tab w:val="left" w:pos="12824"/>
+          <w:tab w:val="left" w:pos="13740"/>
+          <w:tab w:val="left" w:pos="14656"/>
+        </w:tabs>
+        <w:spacing w:after="0" w:line="240" w:lineRule="auto"/>
+        <w:ind w:left="720"/>
+        <w:rPr>
+          <w:rFonts w:ascii="Courier New" w:eastAsia="Times New Roman" w:hAnsi="Courier New" w:cs="Courier New"/>
+          <w:kern w:val="0"/>
+          <w:sz w:val="20"/>
+          <w:szCs w:val="20"/>
+          <w14:ligatures w14:val="none"/>
+        </w:rPr>
+      </w:pPr>
+      <w:proofErr w:type="spellStart"/>
+      <w:r>
+        <w:rPr>
+          <w:rFonts w:ascii="Courier New" w:eastAsia="Times New Roman" w:hAnsi="Courier New" w:cs="Courier New"/>
+          <w:kern w:val="0"/>
+          <w:sz w:val="20"/>
+          <w:szCs w:val="20"/>
+          <w14:ligatures w14:val="none"/>
+        </w:rPr>
+        <w:t>sudo</w:t>
+      </w:r>
+      <w:proofErr w:type="spellEnd"/>
+      <w:r>
+        <w:rPr>
+          <w:rFonts w:ascii="Courier New" w:eastAsia="Times New Roman" w:hAnsi="Courier New" w:cs="Courier New"/>
+          <w:kern w:val="0"/>
+          <w:sz w:val="20"/>
+          <w:szCs w:val="20"/>
+          <w14:ligatures w14:val="none"/>
+        </w:rPr>
+        <w:t xml:space="preserve"> </w:t>
+      </w:r>
+      <w:proofErr w:type="spellStart"/>
+      <w:r>
+        <w:rPr>
+          <w:rFonts w:ascii="Courier New" w:eastAsia="Times New Roman" w:hAnsi="Courier New" w:cs="Courier New"/>
+          <w:kern w:val="0"/>
+          <w:sz w:val="20"/>
+          <w:szCs w:val="20"/>
+          <w14:ligatures w14:val="none"/>
+        </w:rPr>
+        <w:t>systemctl</w:t>
+      </w:r>
+      <w:proofErr w:type="spellEnd"/>
+      <w:r>
+        <w:rPr>
+          <w:rFonts w:ascii="Courier New" w:eastAsia="Times New Roman" w:hAnsi="Courier New" w:cs="Courier New"/>
+          <w:kern w:val="0"/>
+          <w:sz w:val="20"/>
+          <w:szCs w:val="20"/>
+          <w14:ligatures w14:val="none"/>
+        </w:rPr>
+        <w:t xml:space="preserve"> restart pgpool2</w:t>
+      </w:r>
+    </w:p>
+    <w:p>
+      <w:pPr>
+        <w:spacing w:before="100" w:beforeAutospacing="1" w:after="100" w:afterAutospacing="1" w:line="240" w:lineRule="auto"/>
+        <w:ind w:left="720"/>
+        <w:rPr>
+          <w:rFonts w:ascii="Times New Roman" w:eastAsia="Times New Roman" w:hAnsi="Times New Roman" w:cs="Times New Roman"/>
+          <w:kern w:val="0"/>
+          <w:szCs w:val="24"/>
+          <w14:ligatures w14:val="none"/>
+        </w:rPr>
+      </w:pPr>
+      <w:r>
+        <w:rPr>
+          <w:rFonts w:ascii="Times New Roman" w:eastAsia="Times New Roman" w:hAnsi="Times New Roman" w:cs="Times New Roman"/>
+          <w:kern w:val="0"/>
+          <w:szCs w:val="24"/>
+          <w14:ligatures w14:val="none"/>
+        </w:rPr>
+        <w:t xml:space="preserve">Then watch </w:t>
+      </w:r>
+      <w:r>
+        <w:rPr>
+          <w:rFonts w:ascii="Courier New" w:eastAsia="Times New Roman" w:hAnsi="Courier New" w:cs="Courier New"/>
+          <w:kern w:val="0"/>
+          <w:sz w:val="20"/>
+          <w:szCs w:val="20"/>
+          <w14:ligatures w14:val="none"/>
+        </w:rPr>
+        <w:t>/var/log/</w:t>
+      </w:r>
+      <w:proofErr w:type="spellStart"/>
+      <w:r>
+        <w:rPr>
+          <w:rFonts w:ascii="Courier New" w:eastAsia="Times New Roman" w:hAnsi="Courier New" w:cs="Courier New"/>
+          <w:kern w:val="0"/>
+          <w:sz w:val="20"/>
+          <w:szCs w:val="20"/>
+          <w14:ligatures w14:val="none"/>
+        </w:rPr>
+        <w:t>pgpool</w:t>
+      </w:r>
+      <w:proofErr w:type="spellEnd"/>
+      <w:r>
+        <w:rPr>
+          <w:rFonts w:ascii="Courier New" w:eastAsia="Times New Roman" w:hAnsi="Courier New" w:cs="Courier New"/>
+          <w:kern w:val="0"/>
+          <w:sz w:val="20"/>
+          <w:szCs w:val="20"/>
+          <w14:ligatures w14:val="none"/>
+        </w:rPr>
+        <w:t>/pgpool.log</w:t>
+      </w:r>
+      <w:r>
+        <w:rPr>
+          <w:rFonts w:ascii="Times New Roman" w:eastAsia="Times New Roman" w:hAnsi="Times New Roman" w:cs="Times New Roman"/>
+          <w:kern w:val="0"/>
+          <w:szCs w:val="24"/>
+          <w14:ligatures w14:val="none"/>
+        </w:rPr>
+        <w:t xml:space="preserve"> — you’ll see queries routed to different backends.</w:t>
+      </w:r>
+    </w:p>
+    <w:p>
+      <w:pPr>
+        <w:numPr>
+          <w:ilvl w:val="0"/>
+          <w:numId w:val="8"/>
+        </w:numPr>
+        <w:spacing w:before="100" w:beforeAutospacing="1" w:after="100" w:afterAutospacing="1" w:line="240" w:lineRule="auto"/>
+        <w:rPr>
+          <w:rFonts w:ascii="Times New Roman" w:eastAsia="Times New Roman" w:hAnsi="Times New Roman" w:cs="Times New Roman"/>
+          <w:kern w:val="0"/>
+          <w:szCs w:val="24"/>
+          <w14:ligatures w14:val="none"/>
+        </w:rPr>
+      </w:pPr>
+      <w:r>
+        <w:rPr>
+          <w:rFonts w:ascii="Times New Roman" w:eastAsia="Times New Roman" w:hAnsi="Times New Roman" w:cs="Times New Roman"/>
+          <w:b/>
+          <w:bCs/>
+          <w:kern w:val="0"/>
+          <w:szCs w:val="24"/>
+          <w14:ligatures w14:val="none"/>
+        </w:rPr>
+        <w:t>Test read vs write</w:t>
+      </w:r>
+    </w:p>
+    <w:p>
+      <w:pPr>
+        <w:numPr>
+          <w:ilvl w:val="1"/>
+          <w:numId w:val="8"/>
+        </w:numPr>
+        <w:spacing w:before="100" w:beforeAutospacing="1" w:after="100" w:afterAutospacing="1" w:line="240" w:lineRule="auto"/>
+        <w:rPr>
+          <w:rFonts w:ascii="Times New Roman" w:eastAsia="Times New Roman" w:hAnsi="Times New Roman" w:cs="Times New Roman"/>
+          <w:kern w:val="0"/>
+          <w:szCs w:val="24"/>
+          <w14:ligatures w14:val="none"/>
+        </w:rPr>
+      </w:pPr>
+      <w:r>
+        <w:rPr>
+          <w:rFonts w:ascii="Times New Roman" w:eastAsia="Times New Roman" w:hAnsi="Times New Roman" w:cs="Times New Roman"/>
+          <w:kern w:val="0"/>
+          <w:szCs w:val="24"/>
+          <w14:ligatures w14:val="none"/>
+        </w:rPr>
+        <w:t xml:space="preserve">Run a </w:t>
+      </w:r>
+      <w:r>
+        <w:rPr>
+          <w:rFonts w:ascii="Times New Roman" w:eastAsia="Times New Roman" w:hAnsi="Times New Roman" w:cs="Times New Roman"/>
+          <w:b/>
+          <w:bCs/>
+          <w:kern w:val="0"/>
+          <w:szCs w:val="24"/>
+          <w14:ligatures w14:val="none"/>
+        </w:rPr>
+        <w:t>SELECT</w:t>
+      </w:r>
+      <w:r>
+        <w:rPr>
+          <w:rFonts w:ascii="Times New Roman" w:eastAsia="Times New Roman" w:hAnsi="Times New Roman" w:cs="Times New Roman"/>
+          <w:kern w:val="0"/>
+          <w:szCs w:val="24"/>
+          <w14:ligatures w14:val="none"/>
+        </w:rPr>
+        <w:t xml:space="preserve"> query multiple times:</w:t>
+      </w:r>
+    </w:p>
+    <w:p>
+      <w:pPr>
+        <w:spacing w:beforeAutospacing="1" w:after="0" w:afterAutospacing="1" w:line="240" w:lineRule="auto"/>
+        <w:ind w:left="1440"/>
+        <w:rPr>
+          <w:rFonts w:ascii="Times New Roman" w:eastAsia="Times New Roman" w:hAnsi="Times New Roman" w:cs="Times New Roman"/>
+          <w:kern w:val="0"/>
+          <w:szCs w:val="24"/>
+          <w14:ligatures w14:val="none"/>
+        </w:rPr>
+      </w:pPr>
+      <w:r>
+        <w:rPr>
+          <w:rFonts w:ascii="Times New Roman" w:eastAsia="Times New Roman" w:hAnsi="Times New Roman" w:cs="Times New Roman"/>
+          <w:kern w:val="0"/>
+          <w:szCs w:val="24"/>
+          <w14:ligatures w14:val="none"/>
+        </w:rPr>
+        <w:t>bash</w:t>
+      </w:r>
+    </w:p>
+    <w:p>
+      <w:pPr>
+        <w:tabs>
+          <w:tab w:val="left" w:pos="916"/>
+          <w:tab w:val="left" w:pos="1832"/>
+          <w:tab w:val="left" w:pos="2748"/>
+          <w:tab w:val="left" w:pos="3664"/>
+          <w:tab w:val="left" w:pos="4580"/>
+          <w:tab w:val="left" w:pos="5496"/>
+          <w:tab w:val="left" w:pos="6412"/>
+          <w:tab w:val="left" w:pos="7328"/>
+          <w:tab w:val="left" w:pos="8244"/>
+          <w:tab w:val="left" w:pos="9160"/>
+          <w:tab w:val="left" w:pos="10076"/>
+          <w:tab w:val="left" w:pos="10992"/>
+          <w:tab w:val="left" w:pos="11908"/>
+          <w:tab w:val="left" w:pos="12824"/>
+          <w:tab w:val="left" w:pos="13740"/>
+          <w:tab w:val="left" w:pos="14656"/>
+        </w:tabs>
+        <w:spacing w:after="0" w:line="240" w:lineRule="auto"/>
+        <w:ind w:left="1440"/>
+        <w:rPr>
+          <w:rFonts w:ascii="Courier New" w:eastAsia="Times New Roman" w:hAnsi="Courier New" w:cs="Courier New"/>
+          <w:kern w:val="0"/>
+          <w:sz w:val="20"/>
+          <w:szCs w:val="20"/>
+          <w14:ligatures w14:val="none"/>
+        </w:rPr>
+      </w:pPr>
+      <w:proofErr w:type="spellStart"/>
+      <w:r>
+        <w:rPr>
+          <w:rFonts w:ascii="Courier New" w:eastAsia="Times New Roman" w:hAnsi="Courier New" w:cs="Courier New"/>
+          <w:kern w:val="0"/>
+          <w:sz w:val="20"/>
+          <w:szCs w:val="20"/>
+          <w14:ligatures w14:val="none"/>
+        </w:rPr>
+        <w:lastRenderedPageBreak/>
+        <w:t>psql</w:t>
+      </w:r>
+      <w:proofErr w:type="spellEnd"/>
+      <w:r>
+        <w:rPr>
+          <w:rFonts w:ascii="Courier New" w:eastAsia="Times New Roman" w:hAnsi="Courier New" w:cs="Courier New"/>
+          <w:kern w:val="0"/>
+          <w:sz w:val="20"/>
+          <w:szCs w:val="20"/>
+          <w14:ligatures w14:val="none"/>
+        </w:rPr>
+        <w:t xml:space="preserve"> -h 156.67.220.92 -p 9999 -U </w:t>
+      </w:r>
+      <w:proofErr w:type="spellStart"/>
+      <w:r>
+        <w:rPr>
+          <w:rFonts w:ascii="Courier New" w:eastAsia="Times New Roman" w:hAnsi="Courier New" w:cs="Courier New"/>
+          <w:kern w:val="0"/>
+          <w:sz w:val="20"/>
+          <w:szCs w:val="20"/>
+          <w14:ligatures w14:val="none"/>
+        </w:rPr>
+        <w:t>odoo</w:t>
+      </w:r>
+      <w:proofErr w:type="spellEnd"/>
+      <w:r>
+        <w:rPr>
+          <w:rFonts w:ascii="Courier New" w:eastAsia="Times New Roman" w:hAnsi="Courier New" w:cs="Courier New"/>
+          <w:kern w:val="0"/>
+          <w:sz w:val="20"/>
+          <w:szCs w:val="20"/>
+          <w14:ligatures w14:val="none"/>
+        </w:rPr>
+        <w:t xml:space="preserve"> -d </w:t>
+      </w:r>
+      <w:proofErr w:type="spellStart"/>
+      <w:r>
+        <w:rPr>
+          <w:rFonts w:ascii="Courier New" w:eastAsia="Times New Roman" w:hAnsi="Courier New" w:cs="Courier New"/>
+          <w:kern w:val="0"/>
+          <w:sz w:val="20"/>
+          <w:szCs w:val="20"/>
+          <w14:ligatures w14:val="none"/>
+        </w:rPr>
+        <w:t>postgres</w:t>
+      </w:r>
+      <w:proofErr w:type="spellEnd"/>
+      <w:r>
+        <w:rPr>
+          <w:rFonts w:ascii="Courier New" w:eastAsia="Times New Roman" w:hAnsi="Courier New" w:cs="Courier New"/>
+          <w:kern w:val="0"/>
+          <w:sz w:val="20"/>
+          <w:szCs w:val="20"/>
+          <w14:ligatures w14:val="none"/>
+        </w:rPr>
+        <w:t xml:space="preserve"> -c "SELECT now();"</w:t>
+      </w:r>
+    </w:p>
+    <w:p>
+      <w:pPr>
+        <w:spacing w:before="100" w:beforeAutospacing="1" w:after="100" w:afterAutospacing="1" w:line="240" w:lineRule="auto"/>
+        <w:ind w:left="1440"/>
+        <w:rPr>
+          <w:rFonts w:ascii="Times New Roman" w:eastAsia="Times New Roman" w:hAnsi="Times New Roman" w:cs="Times New Roman"/>
+          <w:kern w:val="0"/>
+          <w:szCs w:val="24"/>
+          <w14:ligatures w14:val="none"/>
+        </w:rPr>
+      </w:pPr>
+      <w:r>
+        <w:rPr>
+          <w:rFonts w:ascii="Times New Roman" w:eastAsia="Times New Roman" w:hAnsi="Times New Roman" w:cs="Times New Roman"/>
+          <w:kern w:val="0"/>
+          <w:szCs w:val="24"/>
+          <w14:ligatures w14:val="none"/>
+        </w:rPr>
+        <w:t xml:space="preserve">You should see </w:t>
+      </w:r>
+      <w:proofErr w:type="spellStart"/>
+      <w:r>
+        <w:rPr>
+          <w:rFonts w:ascii="Times New Roman" w:eastAsia="Times New Roman" w:hAnsi="Times New Roman" w:cs="Times New Roman"/>
+          <w:kern w:val="0"/>
+          <w:szCs w:val="24"/>
+          <w14:ligatures w14:val="none"/>
+        </w:rPr>
+        <w:t>Pgpool</w:t>
+      </w:r>
+      <w:proofErr w:type="spellEnd"/>
+      <w:r>
+        <w:rPr>
+          <w:rFonts w:ascii="Times New Roman" w:eastAsia="Times New Roman" w:hAnsi="Times New Roman" w:cs="Times New Roman"/>
+          <w:kern w:val="0"/>
+          <w:szCs w:val="24"/>
+          <w14:ligatures w14:val="none"/>
+        </w:rPr>
+        <w:t xml:space="preserve"> alternating between primary and replica.</w:t>
+      </w:r>
+    </w:p>
+    <w:p>
+      <w:pPr>
+        <w:numPr>
+          <w:ilvl w:val="1"/>
+          <w:numId w:val="8"/>
+        </w:numPr>
+        <w:spacing w:before="100" w:beforeAutospacing="1" w:after="100" w:afterAutospacing="1" w:line="240" w:lineRule="auto"/>
+        <w:rPr>
+          <w:rFonts w:ascii="Times New Roman" w:eastAsia="Times New Roman" w:hAnsi="Times New Roman" w:cs="Times New Roman"/>
+          <w:kern w:val="0"/>
+          <w:szCs w:val="24"/>
+          <w14:ligatures w14:val="none"/>
+        </w:rPr>
+      </w:pPr>
+      <w:r>
+        <w:rPr>
+          <w:rFonts w:ascii="Times New Roman" w:eastAsia="Times New Roman" w:hAnsi="Times New Roman" w:cs="Times New Roman"/>
+          <w:kern w:val="0"/>
+          <w:szCs w:val="24"/>
+          <w14:ligatures w14:val="none"/>
+        </w:rPr>
+        <w:t xml:space="preserve">Run an </w:t>
+      </w:r>
+      <w:r>
+        <w:rPr>
+          <w:rFonts w:ascii="Times New Roman" w:eastAsia="Times New Roman" w:hAnsi="Times New Roman" w:cs="Times New Roman"/>
+          <w:b/>
+          <w:bCs/>
+          <w:kern w:val="0"/>
+          <w:szCs w:val="24"/>
+          <w14:ligatures w14:val="none"/>
+        </w:rPr>
+        <w:t>INSERT</w:t>
+      </w:r>
+      <w:r>
+        <w:rPr>
+          <w:rFonts w:ascii="Times New Roman" w:eastAsia="Times New Roman" w:hAnsi="Times New Roman" w:cs="Times New Roman"/>
+          <w:kern w:val="0"/>
+          <w:szCs w:val="24"/>
+          <w14:ligatures w14:val="none"/>
+        </w:rPr>
+        <w:t xml:space="preserve"> or </w:t>
+      </w:r>
+      <w:r>
+        <w:rPr>
+          <w:rFonts w:ascii="Times New Roman" w:eastAsia="Times New Roman" w:hAnsi="Times New Roman" w:cs="Times New Roman"/>
+          <w:b/>
+          <w:bCs/>
+          <w:kern w:val="0"/>
+          <w:szCs w:val="24"/>
+          <w14:ligatures w14:val="none"/>
+        </w:rPr>
+        <w:t>UPDATE</w:t>
+      </w:r>
+      <w:r>
+        <w:rPr>
+          <w:rFonts w:ascii="Times New Roman" w:eastAsia="Times New Roman" w:hAnsi="Times New Roman" w:cs="Times New Roman"/>
+          <w:kern w:val="0"/>
+          <w:szCs w:val="24"/>
+          <w14:ligatures w14:val="none"/>
+        </w:rPr>
+        <w:t>:</w:t>
+      </w:r>
+    </w:p>
+    <w:p>
+      <w:pPr>
+        <w:spacing w:beforeAutospacing="1" w:after="0" w:afterAutospacing="1" w:line="240" w:lineRule="auto"/>
+        <w:ind w:left="1440"/>
+        <w:rPr>
+          <w:rFonts w:ascii="Times New Roman" w:eastAsia="Times New Roman" w:hAnsi="Times New Roman" w:cs="Times New Roman"/>
+          <w:kern w:val="0"/>
+          <w:szCs w:val="24"/>
+          <w14:ligatures w14:val="none"/>
+        </w:rPr>
+      </w:pPr>
+      <w:r>
+        <w:rPr>
+          <w:rFonts w:ascii="Times New Roman" w:eastAsia="Times New Roman" w:hAnsi="Times New Roman" w:cs="Times New Roman"/>
+          <w:kern w:val="0"/>
+          <w:szCs w:val="24"/>
+          <w14:ligatures w14:val="none"/>
+        </w:rPr>
+        <w:t>bash</w:t>
+      </w:r>
+    </w:p>
+    <w:p>
+      <w:pPr>
+        <w:tabs>
+          <w:tab w:val="left" w:pos="916"/>
+          <w:tab w:val="left" w:pos="1832"/>
+          <w:tab w:val="left" w:pos="2748"/>
+          <w:tab w:val="left" w:pos="3664"/>
+          <w:tab w:val="left" w:pos="4580"/>
+          <w:tab w:val="left" w:pos="5496"/>
+          <w:tab w:val="left" w:pos="6412"/>
+          <w:tab w:val="left" w:pos="7328"/>
+          <w:tab w:val="left" w:pos="8244"/>
+          <w:tab w:val="left" w:pos="9160"/>
+          <w:tab w:val="left" w:pos="10076"/>
+          <w:tab w:val="left" w:pos="10992"/>
+          <w:tab w:val="left" w:pos="11908"/>
+          <w:tab w:val="left" w:pos="12824"/>
+          <w:tab w:val="left" w:pos="13740"/>
+          <w:tab w:val="left" w:pos="14656"/>
+        </w:tabs>
+        <w:spacing w:after="0" w:line="240" w:lineRule="auto"/>
+        <w:ind w:left="1440"/>
+        <w:rPr>
+          <w:rFonts w:ascii="Courier New" w:eastAsia="Times New Roman" w:hAnsi="Courier New" w:cs="Courier New"/>
+          <w:kern w:val="0"/>
+          <w:sz w:val="20"/>
+          <w:szCs w:val="20"/>
+          <w14:ligatures w14:val="none"/>
+        </w:rPr>
+      </w:pPr>
+      <w:proofErr w:type="spellStart"/>
+      <w:r>
+        <w:rPr>
+          <w:rFonts w:ascii="Courier New" w:eastAsia="Times New Roman" w:hAnsi="Courier New" w:cs="Courier New"/>
+          <w:kern w:val="0"/>
+          <w:sz w:val="20"/>
+          <w:szCs w:val="20"/>
+          <w14:ligatures w14:val="none"/>
+        </w:rPr>
+        <w:t>psql</w:t>
+      </w:r>
+      <w:proofErr w:type="spellEnd"/>
+      <w:r>
+        <w:rPr>
+          <w:rFonts w:ascii="Courier New" w:eastAsia="Times New Roman" w:hAnsi="Courier New" w:cs="Courier New"/>
+          <w:kern w:val="0"/>
+          <w:sz w:val="20"/>
+          <w:szCs w:val="20"/>
+          <w14:ligatures w14:val="none"/>
+        </w:rPr>
+        <w:t xml:space="preserve"> -h 156.67.220.92 -p 9999 -U </w:t>
+      </w:r>
+      <w:proofErr w:type="spellStart"/>
+      <w:r>
+        <w:rPr>
+          <w:rFonts w:ascii="Courier New" w:eastAsia="Times New Roman" w:hAnsi="Courier New" w:cs="Courier New"/>
+          <w:kern w:val="0"/>
+          <w:sz w:val="20"/>
+          <w:szCs w:val="20"/>
+          <w14:ligatures w14:val="none"/>
+        </w:rPr>
+        <w:t>odoo</w:t>
+      </w:r>
+      <w:proofErr w:type="spellEnd"/>
+      <w:r>
+        <w:rPr>
+          <w:rFonts w:ascii="Courier New" w:eastAsia="Times New Roman" w:hAnsi="Courier New" w:cs="Courier New"/>
+          <w:kern w:val="0"/>
+          <w:sz w:val="20"/>
+          <w:szCs w:val="20"/>
+          <w14:ligatures w14:val="none"/>
+        </w:rPr>
+        <w:t xml:space="preserve"> -d </w:t>
+      </w:r>
+      <w:proofErr w:type="spellStart"/>
+      <w:r>
+        <w:rPr>
+          <w:rFonts w:ascii="Courier New" w:eastAsia="Times New Roman" w:hAnsi="Courier New" w:cs="Courier New"/>
+          <w:kern w:val="0"/>
+          <w:sz w:val="20"/>
+          <w:szCs w:val="20"/>
+          <w14:ligatures w14:val="none"/>
+        </w:rPr>
+        <w:t>postgres</w:t>
+      </w:r>
+      <w:proofErr w:type="spellEnd"/>
+      <w:r>
+        <w:rPr>
+          <w:rFonts w:ascii="Courier New" w:eastAsia="Times New Roman" w:hAnsi="Courier New" w:cs="Courier New"/>
+          <w:kern w:val="0"/>
+          <w:sz w:val="20"/>
+          <w:szCs w:val="20"/>
+          <w14:ligatures w14:val="none"/>
+        </w:rPr>
+        <w:t xml:space="preserve"> -c "CREATE TABLE </w:t>
+      </w:r>
+      <w:proofErr w:type="spellStart"/>
+      <w:r>
+        <w:rPr>
+          <w:rFonts w:ascii="Courier New" w:eastAsia="Times New Roman" w:hAnsi="Courier New" w:cs="Courier New"/>
+          <w:kern w:val="0"/>
+          <w:sz w:val="20"/>
+          <w:szCs w:val="20"/>
+          <w14:ligatures w14:val="none"/>
+        </w:rPr>
+        <w:t>testlb</w:t>
+      </w:r>
+      <w:proofErr w:type="spellEnd"/>
+      <w:r>
+        <w:rPr>
+          <w:rFonts w:ascii="Courier New" w:eastAsia="Times New Roman" w:hAnsi="Courier New" w:cs="Courier New"/>
+          <w:kern w:val="0"/>
+          <w:sz w:val="20"/>
+          <w:szCs w:val="20"/>
+          <w14:ligatures w14:val="none"/>
+        </w:rPr>
+        <w:t>(id serial);"</w:t>
+      </w:r>
+    </w:p>
+    <w:p>
+      <w:pPr>
+        <w:spacing w:before="100" w:beforeAutospacing="1" w:after="100" w:afterAutospacing="1" w:line="240" w:lineRule="auto"/>
+        <w:ind w:left="1440"/>
+        <w:rPr>
+          <w:rFonts w:ascii="Times New Roman" w:eastAsia="Times New Roman" w:hAnsi="Times New Roman" w:cs="Times New Roman"/>
+          <w:kern w:val="0"/>
+          <w:szCs w:val="24"/>
+          <w14:ligatures w14:val="none"/>
+        </w:rPr>
+      </w:pPr>
+      <w:r>
+        <w:rPr>
+          <w:rFonts w:ascii="Times New Roman" w:eastAsia="Times New Roman" w:hAnsi="Times New Roman" w:cs="Times New Roman"/>
+          <w:kern w:val="0"/>
+          <w:szCs w:val="24"/>
+          <w14:ligatures w14:val="none"/>
+        </w:rPr>
+        <w:t xml:space="preserve">This should always go to the </w:t>
+      </w:r>
+      <w:r>
+        <w:rPr>
+          <w:rFonts w:ascii="Times New Roman" w:eastAsia="Times New Roman" w:hAnsi="Times New Roman" w:cs="Times New Roman"/>
+          <w:b/>
+          <w:bCs/>
+          <w:kern w:val="0"/>
+          <w:szCs w:val="24"/>
+          <w14:ligatures w14:val="none"/>
+        </w:rPr>
+        <w:t>primary</w:t>
+      </w:r>
+      <w:r>
+        <w:rPr>
+          <w:rFonts w:ascii="Times New Roman" w:eastAsia="Times New Roman" w:hAnsi="Times New Roman" w:cs="Times New Roman"/>
+          <w:kern w:val="0"/>
+          <w:szCs w:val="24"/>
+          <w14:ligatures w14:val="none"/>
+        </w:rPr>
+        <w:t>.</w:t>
+      </w:r>
+    </w:p>
+    <w:p/>
     <w:p/>
     <w:sectPr>
       <w:pgSz w:w="15840" w:h="12240" w:orient="landscape"/>
@@ -2894,6 +4209,123 @@
     </w:lvl>
   </w:abstractNum>
   <w:abstractNum w:abstractNumId="5" w15:restartNumberingAfterBreak="0">
+    <w:nsid w:val="47501504"/>
+    <w:multiLevelType w:val="multilevel"/>
+    <w:tmpl w:val="BF20C068"/>
+    <w:lvl w:ilvl="0">
+      <w:start w:val="1"/>
+      <w:numFmt w:val="decimal"/>
+      <w:lvlText w:val="%1."/>
+      <w:lvlJc w:val="left"/>
+      <w:pPr>
+        <w:tabs>
+          <w:tab w:val="num" w:pos="720"/>
+        </w:tabs>
+        <w:ind w:left="720" w:hanging="360"/>
+      </w:pPr>
+    </w:lvl>
+    <w:lvl w:ilvl="1">
+      <w:start w:val="1"/>
+      <w:numFmt w:val="bullet"/>
+      <w:lvlText w:val="o"/>
+      <w:lvlJc w:val="left"/>
+      <w:pPr>
+        <w:tabs>
+          <w:tab w:val="num" w:pos="1440"/>
+        </w:tabs>
+        <w:ind w:left="1440" w:hanging="360"/>
+      </w:pPr>
+      <w:rPr>
+        <w:rFonts w:ascii="Courier New" w:hAnsi="Courier New" w:hint="default"/>
+        <w:sz w:val="20"/>
+      </w:rPr>
+    </w:lvl>
+    <w:lvl w:ilvl="2" w:tentative="1">
+      <w:start w:val="1"/>
+      <w:numFmt w:val="decimal"/>
+      <w:lvlText w:val="%3."/>
+      <w:lvlJc w:val="left"/>
+      <w:pPr>
+        <w:tabs>
+          <w:tab w:val="num" w:pos="2160"/>
+        </w:tabs>
+        <w:ind w:left="2160" w:hanging="360"/>
+      </w:pPr>
+    </w:lvl>
+    <w:lvl w:ilvl="3" w:tentative="1">
+      <w:start w:val="1"/>
+      <w:numFmt w:val="decimal"/>
+      <w:lvlText w:val="%4."/>
+      <w:lvlJc w:val="left"/>
+      <w:pPr>
+        <w:tabs>
+          <w:tab w:val="num" w:pos="2880"/>
+        </w:tabs>
+        <w:ind w:left="2880" w:hanging="360"/>
+      </w:pPr>
+    </w:lvl>
+    <w:lvl w:ilvl="4" w:tentative="1">
+      <w:start w:val="1"/>
+      <w:numFmt w:val="decimal"/>
+      <w:lvlText w:val="%5."/>
+      <w:lvlJc w:val="left"/>
+      <w:pPr>
+        <w:tabs>
+          <w:tab w:val="num" w:pos="3600"/>
+        </w:tabs>
+        <w:ind w:left="3600" w:hanging="360"/>
+      </w:pPr>
+    </w:lvl>
+    <w:lvl w:ilvl="5" w:tentative="1">
+      <w:start w:val="1"/>
+      <w:numFmt w:val="decimal"/>
+      <w:lvlText w:val="%6."/>
+      <w:lvlJc w:val="left"/>
+      <w:pPr>
+        <w:tabs>
+          <w:tab w:val="num" w:pos="4320"/>
+        </w:tabs>
+        <w:ind w:left="4320" w:hanging="360"/>
+      </w:pPr>
+    </w:lvl>
+    <w:lvl w:ilvl="6" w:tentative="1">
+      <w:start w:val="1"/>
+      <w:numFmt w:val="decimal"/>
+      <w:lvlText w:val="%7."/>
+      <w:lvlJc w:val="left"/>
+      <w:pPr>
+        <w:tabs>
+          <w:tab w:val="num" w:pos="5040"/>
+        </w:tabs>
+        <w:ind w:left="5040" w:hanging="360"/>
+      </w:pPr>
+    </w:lvl>
+    <w:lvl w:ilvl="7" w:tentative="1">
+      <w:start w:val="1"/>
+      <w:numFmt w:val="decimal"/>
+      <w:lvlText w:val="%8."/>
+      <w:lvlJc w:val="left"/>
+      <w:pPr>
+        <w:tabs>
+          <w:tab w:val="num" w:pos="5760"/>
+        </w:tabs>
+        <w:ind w:left="5760" w:hanging="360"/>
+      </w:pPr>
+    </w:lvl>
+    <w:lvl w:ilvl="8" w:tentative="1">
+      <w:start w:val="1"/>
+      <w:numFmt w:val="decimal"/>
+      <w:lvlText w:val="%9."/>
+      <w:lvlJc w:val="left"/>
+      <w:pPr>
+        <w:tabs>
+          <w:tab w:val="num" w:pos="6480"/>
+        </w:tabs>
+        <w:ind w:left="6480" w:hanging="360"/>
+      </w:pPr>
+    </w:lvl>
+  </w:abstractNum>
+  <w:abstractNum w:abstractNumId="6" w15:restartNumberingAfterBreak="0">
     <w:nsid w:val="60C82708"/>
     <w:multiLevelType w:val="multilevel"/>
     <w:tmpl w:val="40E8690E"/>
@@ -3042,7 +4474,7 @@
       </w:rPr>
     </w:lvl>
   </w:abstractNum>
-  <w:abstractNum w:abstractNumId="6" w15:restartNumberingAfterBreak="0">
+  <w:abstractNum w:abstractNumId="7" w15:restartNumberingAfterBreak="0">
     <w:nsid w:val="7DD52017"/>
     <w:multiLevelType w:val="multilevel"/>
     <w:tmpl w:val="8F3420EA"/>
@@ -3195,7 +4627,7 @@
     <w:abstractNumId w:val="4"/>
   </w:num>
   <w:num w:numId="2" w16cid:durableId="484709528">
-    <w:abstractNumId w:val="6"/>
+    <w:abstractNumId w:val="7"/>
   </w:num>
   <w:num w:numId="3" w16cid:durableId="777287307">
     <w:abstractNumId w:val="3"/>
@@ -3210,6 +4642,9 @@
     <w:abstractNumId w:val="1"/>
   </w:num>
   <w:num w:numId="7" w16cid:durableId="1472870171">
+    <w:abstractNumId w:val="6"/>
+  </w:num>
+  <w:num w:numId="8" w16cid:durableId="1728450676">
     <w:abstractNumId w:val="5"/>
   </w:num>
 </w:numbering>
@@ -3819,6 +5254,7 @@
   <w:style w:type="character" w:default="1" w:styleId="DefaultParagraphFont">
     <w:name w:val="Default Paragraph Font"/>
     <w:uiPriority w:val="1"/>
+    <w:semiHidden/>
     <w:unhideWhenUsed/>
   </w:style>
   <w:style w:type="table" w:default="1" w:styleId="TableNormal">

</xml_diff>